<commit_message>
docs: next 3 seq diagrams and update fixes in use cases and robustness
</commit_message>
<xml_diff>
--- a/3rd_phase/Sequence-diagram-v0.1.docx
+++ b/3rd_phase/Sequence-diagram-v0.1.docx
@@ -1369,6 +1369,7 @@
       <w:r>
         <w:rPr>
           <w:rFonts w:ascii="Calibri" w:hAnsi="Calibri" w:cs="Calibri"/>
+          <w:noProof/>
           <w:lang w:val="el-GR"/>
         </w:rPr>
         <w:drawing>
@@ -1414,6 +1415,7 @@
         <w:jc w:val="center"/>
         <w:rPr>
           <w:rFonts w:ascii="Calibri" w:hAnsi="Calibri" w:cs="Calibri"/>
+          <w:lang w:val="el-GR"/>
         </w:rPr>
       </w:pPr>
       <w:r>
@@ -1536,6 +1538,7 @@
       <w:pPr>
         <w:rPr>
           <w:rFonts w:ascii="Calibri" w:hAnsi="Calibri" w:cs="Calibri"/>
+          <w:lang w:val="el-GR"/>
         </w:rPr>
       </w:pPr>
     </w:p>
@@ -1714,13 +1717,14 @@
       <w:r>
         <w:rPr>
           <w:rFonts w:ascii="Calibri" w:hAnsi="Calibri" w:cs="Calibri"/>
+          <w:noProof/>
           <w:lang w:val="el-GR"/>
         </w:rPr>
         <w:drawing>
-          <wp:inline distT="0" distB="0" distL="0" distR="0" wp14:anchorId="305E013D" wp14:editId="78ED1619">
-            <wp:extent cx="5943600" cy="4681855"/>
-            <wp:effectExtent l="0" t="0" r="0" b="4445"/>
-            <wp:docPr id="1663793309" name="Picture 1"/>
+          <wp:inline distT="0" distB="0" distL="0" distR="0" wp14:anchorId="5D863C3F" wp14:editId="08A88495">
+            <wp:extent cx="5943600" cy="4585335"/>
+            <wp:effectExtent l="0" t="0" r="0" b="5715"/>
+            <wp:docPr id="568602741" name="Picture 1"/>
             <wp:cNvGraphicFramePr>
               <a:graphicFrameLocks xmlns:a="http://schemas.openxmlformats.org/drawingml/2006/main" noChangeAspect="1"/>
             </wp:cNvGraphicFramePr>
@@ -1728,7 +1732,7 @@
               <a:graphicData uri="http://schemas.openxmlformats.org/drawingml/2006/picture">
                 <pic:pic xmlns:pic="http://schemas.openxmlformats.org/drawingml/2006/picture">
                   <pic:nvPicPr>
-                    <pic:cNvPr id="1663793309" name=""/>
+                    <pic:cNvPr id="568602741" name=""/>
                     <pic:cNvPicPr/>
                   </pic:nvPicPr>
                   <pic:blipFill>
@@ -1740,7 +1744,7 @@
                   <pic:spPr>
                     <a:xfrm>
                       <a:off x="0" y="0"/>
-                      <a:ext cx="5943600" cy="4681855"/>
+                      <a:ext cx="5943600" cy="4585335"/>
                     </a:xfrm>
                     <a:prstGeom prst="rect">
                       <a:avLst/>
@@ -1759,6 +1763,7 @@
         <w:jc w:val="center"/>
         <w:rPr>
           <w:rFonts w:ascii="Calibri" w:hAnsi="Calibri" w:cs="Calibri"/>
+          <w:lang w:val="el-GR"/>
         </w:rPr>
       </w:pPr>
       <w:r>
@@ -1826,6 +1831,7 @@
       <w:pPr>
         <w:rPr>
           <w:rFonts w:ascii="Calibri" w:hAnsi="Calibri" w:cs="Calibri"/>
+          <w:lang w:val="el-GR"/>
         </w:rPr>
       </w:pPr>
     </w:p>
@@ -2000,6 +2006,32 @@
       <w:r>
         <w:rPr>
           <w:rFonts w:ascii="Calibri" w:hAnsi="Calibri" w:cs="Calibri"/>
+          <w:i/>
+          <w:iCs/>
+          <w:lang w:val="el-GR"/>
+        </w:rPr>
+        <w:t xml:space="preserve"> (</w:t>
+      </w:r>
+      <w:r>
+        <w:rPr>
+          <w:rFonts w:ascii="Calibri" w:hAnsi="Calibri" w:cs="Calibri"/>
+          <w:i/>
+          <w:iCs/>
+        </w:rPr>
+        <w:t>User</w:t>
+      </w:r>
+      <w:r>
+        <w:rPr>
+          <w:rFonts w:ascii="Calibri" w:hAnsi="Calibri" w:cs="Calibri"/>
+          <w:i/>
+          <w:iCs/>
+          <w:lang w:val="el-GR"/>
+        </w:rPr>
+        <w:t>)</w:t>
+      </w:r>
+      <w:r>
+        <w:rPr>
+          <w:rFonts w:ascii="Calibri" w:hAnsi="Calibri" w:cs="Calibri"/>
           <w:lang w:val="el-GR"/>
         </w:rPr>
         <w:t>.</w:t>
@@ -2017,6 +2049,7 @@
       <w:r>
         <w:rPr>
           <w:rFonts w:ascii="Calibri" w:hAnsi="Calibri" w:cs="Calibri"/>
+          <w:noProof/>
           <w:lang w:val="el-GR"/>
         </w:rPr>
         <w:drawing>
@@ -2062,6 +2095,7 @@
         <w:jc w:val="center"/>
         <w:rPr>
           <w:rFonts w:ascii="Calibri" w:hAnsi="Calibri" w:cs="Calibri"/>
+          <w:lang w:val="el-GR"/>
         </w:rPr>
       </w:pPr>
       <w:r>
@@ -2082,24 +2116,43 @@
         <w:rPr>
           <w:rFonts w:ascii="Calibri" w:hAnsi="Calibri" w:cs="Calibri"/>
         </w:rPr>
-        <w:t>Use Case</w:t>
-      </w:r>
-    </w:p>
-    <w:p>
-      <w:pPr>
-        <w:rPr>
-          <w:lang w:val="el-GR"/>
-        </w:rPr>
-      </w:pPr>
-    </w:p>
-    <w:p>
-      <w:pPr>
-        <w:rPr>
-          <w:lang w:val="el-GR"/>
-        </w:rPr>
-      </w:pPr>
-    </w:p>
-    <w:p/>
+        <w:t>Use</w:t>
+      </w:r>
+      <w:r>
+        <w:rPr>
+          <w:rFonts w:ascii="Calibri" w:hAnsi="Calibri" w:cs="Calibri"/>
+          <w:lang w:val="el-GR"/>
+        </w:rPr>
+        <w:t xml:space="preserve"> </w:t>
+      </w:r>
+      <w:r>
+        <w:rPr>
+          <w:rFonts w:ascii="Calibri" w:hAnsi="Calibri" w:cs="Calibri"/>
+        </w:rPr>
+        <w:t>Case</w:t>
+      </w:r>
+    </w:p>
+    <w:p>
+      <w:pPr>
+        <w:rPr>
+          <w:lang w:val="el-GR"/>
+        </w:rPr>
+      </w:pPr>
+    </w:p>
+    <w:p>
+      <w:pPr>
+        <w:rPr>
+          <w:lang w:val="el-GR"/>
+        </w:rPr>
+      </w:pPr>
+    </w:p>
+    <w:p>
+      <w:pPr>
+        <w:rPr>
+          <w:lang w:val="el-GR"/>
+        </w:rPr>
+      </w:pPr>
+    </w:p>
     <w:p>
       <w:pPr>
         <w:pBdr>
@@ -2324,6 +2377,32 @@
       <w:r>
         <w:rPr>
           <w:rFonts w:ascii="Calibri" w:hAnsi="Calibri" w:cs="Calibri"/>
+          <w:i/>
+          <w:iCs/>
+          <w:lang w:val="el-GR"/>
+        </w:rPr>
+        <w:t xml:space="preserve"> (</w:t>
+      </w:r>
+      <w:r>
+        <w:rPr>
+          <w:rFonts w:ascii="Calibri" w:hAnsi="Calibri" w:cs="Calibri"/>
+          <w:i/>
+          <w:iCs/>
+        </w:rPr>
+        <w:t>User</w:t>
+      </w:r>
+      <w:r>
+        <w:rPr>
+          <w:rFonts w:ascii="Calibri" w:hAnsi="Calibri" w:cs="Calibri"/>
+          <w:i/>
+          <w:iCs/>
+          <w:lang w:val="el-GR"/>
+        </w:rPr>
+        <w:t>)</w:t>
+      </w:r>
+      <w:r>
+        <w:rPr>
+          <w:rFonts w:ascii="Calibri" w:hAnsi="Calibri" w:cs="Calibri"/>
           <w:lang w:val="el-GR"/>
         </w:rPr>
         <w:t>.</w:t>
@@ -2338,6 +2417,47 @@
           <w:lang w:val="el-GR"/>
         </w:rPr>
       </w:pPr>
+      <w:r>
+        <w:rPr>
+          <w:rFonts w:ascii="Calibri" w:hAnsi="Calibri" w:cs="Calibri"/>
+          <w:lang w:val="el-GR"/>
+        </w:rPr>
+        <w:drawing>
+          <wp:inline distT="0" distB="0" distL="0" distR="0" wp14:anchorId="7BAB7E89" wp14:editId="2B2BB3C7">
+            <wp:extent cx="5943600" cy="6303645"/>
+            <wp:effectExtent l="0" t="0" r="0" b="1905"/>
+            <wp:docPr id="1918822763" name="Picture 1"/>
+            <wp:cNvGraphicFramePr>
+              <a:graphicFrameLocks xmlns:a="http://schemas.openxmlformats.org/drawingml/2006/main" noChangeAspect="1"/>
+            </wp:cNvGraphicFramePr>
+            <a:graphic xmlns:a="http://schemas.openxmlformats.org/drawingml/2006/main">
+              <a:graphicData uri="http://schemas.openxmlformats.org/drawingml/2006/picture">
+                <pic:pic xmlns:pic="http://schemas.openxmlformats.org/drawingml/2006/picture">
+                  <pic:nvPicPr>
+                    <pic:cNvPr id="1918822763" name=""/>
+                    <pic:cNvPicPr/>
+                  </pic:nvPicPr>
+                  <pic:blipFill>
+                    <a:blip r:embed="rId13"/>
+                    <a:stretch>
+                      <a:fillRect/>
+                    </a:stretch>
+                  </pic:blipFill>
+                  <pic:spPr>
+                    <a:xfrm>
+                      <a:off x="0" y="0"/>
+                      <a:ext cx="5943600" cy="6303645"/>
+                    </a:xfrm>
+                    <a:prstGeom prst="rect">
+                      <a:avLst/>
+                    </a:prstGeom>
+                  </pic:spPr>
+                </pic:pic>
+              </a:graphicData>
+            </a:graphic>
+          </wp:inline>
+        </w:drawing>
+      </w:r>
     </w:p>
     <w:p>
       <w:pPr>
@@ -2345,6 +2465,7 @@
         <w:jc w:val="center"/>
         <w:rPr>
           <w:rFonts w:ascii="Calibri" w:hAnsi="Calibri" w:cs="Calibri"/>
+          <w:lang w:val="el-GR"/>
         </w:rPr>
       </w:pPr>
       <w:r>
@@ -2365,152 +2486,21 @@
         <w:rPr>
           <w:rFonts w:ascii="Calibri" w:hAnsi="Calibri" w:cs="Calibri"/>
         </w:rPr>
-        <w:t>Use Case</w:t>
-      </w:r>
-    </w:p>
-    <w:p>
-      <w:pPr>
-        <w:rPr>
-          <w:rFonts w:ascii="Calibri" w:hAnsi="Calibri" w:cs="Calibri"/>
-          <w:lang w:val="el-GR"/>
-        </w:rPr>
-      </w:pPr>
-    </w:p>
-    <w:p>
-      <w:pPr>
-        <w:rPr>
-          <w:rFonts w:ascii="Calibri" w:hAnsi="Calibri" w:cs="Calibri"/>
-          <w:lang w:val="el-GR"/>
-        </w:rPr>
-      </w:pPr>
-    </w:p>
-    <w:p>
-      <w:pPr>
-        <w:rPr>
-          <w:rFonts w:ascii="Calibri" w:hAnsi="Calibri" w:cs="Calibri"/>
-          <w:lang w:val="el-GR"/>
-        </w:rPr>
-      </w:pPr>
-    </w:p>
-    <w:p>
-      <w:pPr>
-        <w:rPr>
-          <w:rFonts w:ascii="Calibri" w:hAnsi="Calibri" w:cs="Calibri"/>
-          <w:lang w:val="el-GR"/>
-        </w:rPr>
-      </w:pPr>
-    </w:p>
-    <w:p>
-      <w:pPr>
-        <w:rPr>
-          <w:rFonts w:ascii="Calibri" w:hAnsi="Calibri" w:cs="Calibri"/>
-          <w:lang w:val="el-GR"/>
-        </w:rPr>
-      </w:pPr>
-    </w:p>
-    <w:p>
-      <w:pPr>
-        <w:rPr>
-          <w:rFonts w:ascii="Calibri" w:hAnsi="Calibri" w:cs="Calibri"/>
-          <w:lang w:val="el-GR"/>
-        </w:rPr>
-      </w:pPr>
-    </w:p>
-    <w:p>
-      <w:pPr>
-        <w:rPr>
-          <w:rFonts w:ascii="Calibri" w:hAnsi="Calibri" w:cs="Calibri"/>
-          <w:lang w:val="el-GR"/>
-        </w:rPr>
-      </w:pPr>
-    </w:p>
-    <w:p>
-      <w:pPr>
-        <w:rPr>
-          <w:rFonts w:ascii="Calibri" w:hAnsi="Calibri" w:cs="Calibri"/>
-          <w:lang w:val="el-GR"/>
-        </w:rPr>
-      </w:pPr>
-    </w:p>
-    <w:p>
-      <w:pPr>
-        <w:rPr>
-          <w:rFonts w:ascii="Calibri" w:hAnsi="Calibri" w:cs="Calibri"/>
-          <w:lang w:val="el-GR"/>
-        </w:rPr>
-      </w:pPr>
-    </w:p>
-    <w:p>
-      <w:pPr>
-        <w:rPr>
-          <w:rFonts w:ascii="Calibri" w:hAnsi="Calibri" w:cs="Calibri"/>
-          <w:lang w:val="el-GR"/>
-        </w:rPr>
-      </w:pPr>
-    </w:p>
-    <w:p>
-      <w:pPr>
-        <w:rPr>
-          <w:rFonts w:ascii="Calibri" w:hAnsi="Calibri" w:cs="Calibri"/>
-          <w:lang w:val="el-GR"/>
-        </w:rPr>
-      </w:pPr>
-    </w:p>
-    <w:p>
-      <w:pPr>
-        <w:rPr>
-          <w:rFonts w:ascii="Calibri" w:hAnsi="Calibri" w:cs="Calibri"/>
-          <w:lang w:val="el-GR"/>
-        </w:rPr>
-      </w:pPr>
-    </w:p>
-    <w:p>
-      <w:pPr>
-        <w:rPr>
-          <w:rFonts w:ascii="Calibri" w:hAnsi="Calibri" w:cs="Calibri"/>
-          <w:lang w:val="el-GR"/>
-        </w:rPr>
-      </w:pPr>
-    </w:p>
-    <w:p>
-      <w:pPr>
-        <w:rPr>
-          <w:rFonts w:ascii="Calibri" w:hAnsi="Calibri" w:cs="Calibri"/>
-          <w:lang w:val="el-GR"/>
-        </w:rPr>
-      </w:pPr>
-    </w:p>
-    <w:p>
-      <w:pPr>
-        <w:rPr>
-          <w:rFonts w:ascii="Calibri" w:hAnsi="Calibri" w:cs="Calibri"/>
-          <w:lang w:val="el-GR"/>
-        </w:rPr>
-      </w:pPr>
-    </w:p>
-    <w:p>
-      <w:pPr>
-        <w:rPr>
-          <w:rFonts w:ascii="Calibri" w:hAnsi="Calibri" w:cs="Calibri"/>
-          <w:lang w:val="el-GR"/>
-        </w:rPr>
-      </w:pPr>
-    </w:p>
-    <w:p>
-      <w:pPr>
-        <w:rPr>
-          <w:rFonts w:ascii="Calibri" w:hAnsi="Calibri" w:cs="Calibri"/>
-          <w:lang w:val="el-GR"/>
-        </w:rPr>
-      </w:pPr>
-    </w:p>
-    <w:p>
-      <w:pPr>
-        <w:rPr>
-          <w:rFonts w:ascii="Calibri" w:hAnsi="Calibri" w:cs="Calibri"/>
-          <w:lang w:val="el-GR"/>
-        </w:rPr>
-      </w:pPr>
+        <w:t>Use</w:t>
+      </w:r>
+      <w:r>
+        <w:rPr>
+          <w:rFonts w:ascii="Calibri" w:hAnsi="Calibri" w:cs="Calibri"/>
+          <w:lang w:val="el-GR"/>
+        </w:rPr>
+        <w:t xml:space="preserve"> </w:t>
+      </w:r>
+      <w:r>
+        <w:rPr>
+          <w:rFonts w:ascii="Calibri" w:hAnsi="Calibri" w:cs="Calibri"/>
+        </w:rPr>
+        <w:t>Case</w:t>
+      </w:r>
     </w:p>
     <w:p>
       <w:pPr>
@@ -2722,6 +2712,32 @@
       <w:r>
         <w:rPr>
           <w:rFonts w:ascii="Calibri" w:hAnsi="Calibri" w:cs="Calibri"/>
+          <w:i/>
+          <w:iCs/>
+          <w:lang w:val="el-GR"/>
+        </w:rPr>
+        <w:t xml:space="preserve"> (</w:t>
+      </w:r>
+      <w:r>
+        <w:rPr>
+          <w:rFonts w:ascii="Calibri" w:hAnsi="Calibri" w:cs="Calibri"/>
+          <w:i/>
+          <w:iCs/>
+        </w:rPr>
+        <w:t>User</w:t>
+      </w:r>
+      <w:r>
+        <w:rPr>
+          <w:rFonts w:ascii="Calibri" w:hAnsi="Calibri" w:cs="Calibri"/>
+          <w:i/>
+          <w:iCs/>
+          <w:lang w:val="el-GR"/>
+        </w:rPr>
+        <w:t>)</w:t>
+      </w:r>
+      <w:r>
+        <w:rPr>
+          <w:rFonts w:ascii="Calibri" w:hAnsi="Calibri" w:cs="Calibri"/>
           <w:lang w:val="el-GR"/>
         </w:rPr>
         <w:t>.</w:t>
@@ -2736,6 +2752,48 @@
           <w:lang w:val="el-GR"/>
         </w:rPr>
       </w:pPr>
+      <w:r>
+        <w:rPr>
+          <w:rFonts w:ascii="Calibri" w:hAnsi="Calibri" w:cs="Calibri"/>
+          <w:noProof/>
+          <w:lang w:val="el-GR"/>
+        </w:rPr>
+        <w:drawing>
+          <wp:inline distT="0" distB="0" distL="0" distR="0" wp14:anchorId="61E4EFA6" wp14:editId="70EA918B">
+            <wp:extent cx="5943600" cy="3745230"/>
+            <wp:effectExtent l="0" t="0" r="0" b="7620"/>
+            <wp:docPr id="719660941" name="Picture 1"/>
+            <wp:cNvGraphicFramePr>
+              <a:graphicFrameLocks xmlns:a="http://schemas.openxmlformats.org/drawingml/2006/main" noChangeAspect="1"/>
+            </wp:cNvGraphicFramePr>
+            <a:graphic xmlns:a="http://schemas.openxmlformats.org/drawingml/2006/main">
+              <a:graphicData uri="http://schemas.openxmlformats.org/drawingml/2006/picture">
+                <pic:pic xmlns:pic="http://schemas.openxmlformats.org/drawingml/2006/picture">
+                  <pic:nvPicPr>
+                    <pic:cNvPr id="719660941" name=""/>
+                    <pic:cNvPicPr/>
+                  </pic:nvPicPr>
+                  <pic:blipFill>
+                    <a:blip r:embed="rId14"/>
+                    <a:stretch>
+                      <a:fillRect/>
+                    </a:stretch>
+                  </pic:blipFill>
+                  <pic:spPr>
+                    <a:xfrm>
+                      <a:off x="0" y="0"/>
+                      <a:ext cx="5943600" cy="3745230"/>
+                    </a:xfrm>
+                    <a:prstGeom prst="rect">
+                      <a:avLst/>
+                    </a:prstGeom>
+                  </pic:spPr>
+                </pic:pic>
+              </a:graphicData>
+            </a:graphic>
+          </wp:inline>
+        </w:drawing>
+      </w:r>
     </w:p>
     <w:p>
       <w:pPr>
@@ -2743,6 +2801,7 @@
         <w:jc w:val="center"/>
         <w:rPr>
           <w:rFonts w:ascii="Calibri" w:hAnsi="Calibri" w:cs="Calibri"/>
+          <w:lang w:val="el-GR"/>
         </w:rPr>
       </w:pPr>
       <w:r>
@@ -2763,96 +2822,21 @@
         <w:rPr>
           <w:rFonts w:ascii="Calibri" w:hAnsi="Calibri" w:cs="Calibri"/>
         </w:rPr>
-        <w:t>Use Case</w:t>
-      </w:r>
-    </w:p>
-    <w:p>
-      <w:pPr>
-        <w:rPr>
-          <w:rFonts w:ascii="Calibri" w:hAnsi="Calibri" w:cs="Calibri"/>
-          <w:lang w:val="el-GR"/>
-        </w:rPr>
-      </w:pPr>
-    </w:p>
-    <w:p>
-      <w:pPr>
-        <w:rPr>
-          <w:rFonts w:ascii="Calibri" w:hAnsi="Calibri" w:cs="Calibri"/>
-          <w:lang w:val="el-GR"/>
-        </w:rPr>
-      </w:pPr>
-    </w:p>
-    <w:p>
-      <w:pPr>
-        <w:rPr>
-          <w:rFonts w:ascii="Calibri" w:hAnsi="Calibri" w:cs="Calibri"/>
-          <w:lang w:val="el-GR"/>
-        </w:rPr>
-      </w:pPr>
-    </w:p>
-    <w:p>
-      <w:pPr>
-        <w:rPr>
-          <w:rFonts w:ascii="Calibri" w:hAnsi="Calibri" w:cs="Calibri"/>
-          <w:lang w:val="el-GR"/>
-        </w:rPr>
-      </w:pPr>
-    </w:p>
-    <w:p>
-      <w:pPr>
-        <w:rPr>
-          <w:rFonts w:ascii="Calibri" w:hAnsi="Calibri" w:cs="Calibri"/>
-          <w:lang w:val="el-GR"/>
-        </w:rPr>
-      </w:pPr>
-    </w:p>
-    <w:p>
-      <w:pPr>
-        <w:rPr>
-          <w:rFonts w:ascii="Calibri" w:hAnsi="Calibri" w:cs="Calibri"/>
-          <w:lang w:val="el-GR"/>
-        </w:rPr>
-      </w:pPr>
-    </w:p>
-    <w:p>
-      <w:pPr>
-        <w:rPr>
-          <w:rFonts w:ascii="Calibri" w:hAnsi="Calibri" w:cs="Calibri"/>
-          <w:lang w:val="el-GR"/>
-        </w:rPr>
-      </w:pPr>
-    </w:p>
-    <w:p>
-      <w:pPr>
-        <w:rPr>
-          <w:rFonts w:ascii="Calibri" w:hAnsi="Calibri" w:cs="Calibri"/>
-          <w:lang w:val="el-GR"/>
-        </w:rPr>
-      </w:pPr>
-    </w:p>
-    <w:p>
-      <w:pPr>
-        <w:rPr>
-          <w:rFonts w:ascii="Calibri" w:hAnsi="Calibri" w:cs="Calibri"/>
-          <w:lang w:val="el-GR"/>
-        </w:rPr>
-      </w:pPr>
-    </w:p>
-    <w:p>
-      <w:pPr>
-        <w:rPr>
-          <w:rFonts w:ascii="Calibri" w:hAnsi="Calibri" w:cs="Calibri"/>
-          <w:lang w:val="el-GR"/>
-        </w:rPr>
-      </w:pPr>
-    </w:p>
-    <w:p>
-      <w:pPr>
-        <w:rPr>
-          <w:rFonts w:ascii="Calibri" w:hAnsi="Calibri" w:cs="Calibri"/>
-          <w:lang w:val="el-GR"/>
-        </w:rPr>
-      </w:pPr>
+        <w:t>Use</w:t>
+      </w:r>
+      <w:r>
+        <w:rPr>
+          <w:rFonts w:ascii="Calibri" w:hAnsi="Calibri" w:cs="Calibri"/>
+          <w:lang w:val="el-GR"/>
+        </w:rPr>
+        <w:t xml:space="preserve"> </w:t>
+      </w:r>
+      <w:r>
+        <w:rPr>
+          <w:rFonts w:ascii="Calibri" w:hAnsi="Calibri" w:cs="Calibri"/>
+        </w:rPr>
+        <w:t>Case</w:t>
+      </w:r>
     </w:p>
     <w:p>
       <w:pPr>
@@ -3102,6 +3086,32 @@
       <w:r>
         <w:rPr>
           <w:rFonts w:ascii="Calibri" w:hAnsi="Calibri" w:cs="Calibri"/>
+          <w:i/>
+          <w:iCs/>
+          <w:lang w:val="el-GR"/>
+        </w:rPr>
+        <w:t xml:space="preserve"> (</w:t>
+      </w:r>
+      <w:r>
+        <w:rPr>
+          <w:rFonts w:ascii="Calibri" w:hAnsi="Calibri" w:cs="Calibri"/>
+          <w:i/>
+          <w:iCs/>
+        </w:rPr>
+        <w:t>User</w:t>
+      </w:r>
+      <w:r>
+        <w:rPr>
+          <w:rFonts w:ascii="Calibri" w:hAnsi="Calibri" w:cs="Calibri"/>
+          <w:i/>
+          <w:iCs/>
+          <w:lang w:val="el-GR"/>
+        </w:rPr>
+        <w:t>)</w:t>
+      </w:r>
+      <w:r>
+        <w:rPr>
+          <w:rFonts w:ascii="Calibri" w:hAnsi="Calibri" w:cs="Calibri"/>
           <w:lang w:val="el-GR"/>
         </w:rPr>
         <w:t>.</w:t>
@@ -3116,6 +3126,48 @@
           <w:lang w:val="el-GR"/>
         </w:rPr>
       </w:pPr>
+      <w:r>
+        <w:rPr>
+          <w:rFonts w:ascii="Calibri" w:hAnsi="Calibri" w:cs="Calibri"/>
+          <w:noProof/>
+          <w:lang w:val="el-GR"/>
+        </w:rPr>
+        <w:drawing>
+          <wp:inline distT="0" distB="0" distL="0" distR="0" wp14:anchorId="7E3AD650" wp14:editId="15C41B4D">
+            <wp:extent cx="5943600" cy="5798185"/>
+            <wp:effectExtent l="0" t="0" r="0" b="0"/>
+            <wp:docPr id="1671078721" name="Picture 1"/>
+            <wp:cNvGraphicFramePr>
+              <a:graphicFrameLocks xmlns:a="http://schemas.openxmlformats.org/drawingml/2006/main" noChangeAspect="1"/>
+            </wp:cNvGraphicFramePr>
+            <a:graphic xmlns:a="http://schemas.openxmlformats.org/drawingml/2006/main">
+              <a:graphicData uri="http://schemas.openxmlformats.org/drawingml/2006/picture">
+                <pic:pic xmlns:pic="http://schemas.openxmlformats.org/drawingml/2006/picture">
+                  <pic:nvPicPr>
+                    <pic:cNvPr id="1671078721" name=""/>
+                    <pic:cNvPicPr/>
+                  </pic:nvPicPr>
+                  <pic:blipFill>
+                    <a:blip r:embed="rId15"/>
+                    <a:stretch>
+                      <a:fillRect/>
+                    </a:stretch>
+                  </pic:blipFill>
+                  <pic:spPr>
+                    <a:xfrm>
+                      <a:off x="0" y="0"/>
+                      <a:ext cx="5943600" cy="5798185"/>
+                    </a:xfrm>
+                    <a:prstGeom prst="rect">
+                      <a:avLst/>
+                    </a:prstGeom>
+                  </pic:spPr>
+                </pic:pic>
+              </a:graphicData>
+            </a:graphic>
+          </wp:inline>
+        </w:drawing>
+      </w:r>
     </w:p>
     <w:p>
       <w:pPr>
@@ -3123,6 +3175,7 @@
         <w:jc w:val="center"/>
         <w:rPr>
           <w:rFonts w:ascii="Calibri" w:hAnsi="Calibri" w:cs="Calibri"/>
+          <w:lang w:val="el-GR"/>
         </w:rPr>
       </w:pPr>
       <w:r>
@@ -3143,152 +3196,21 @@
         <w:rPr>
           <w:rFonts w:ascii="Calibri" w:hAnsi="Calibri" w:cs="Calibri"/>
         </w:rPr>
-        <w:t>CRC Card</w:t>
-      </w:r>
-    </w:p>
-    <w:p>
-      <w:pPr>
-        <w:rPr>
-          <w:rFonts w:ascii="Calibri" w:hAnsi="Calibri" w:cs="Calibri"/>
-          <w:lang w:val="el-GR"/>
-        </w:rPr>
-      </w:pPr>
-    </w:p>
-    <w:p>
-      <w:pPr>
-        <w:rPr>
-          <w:rFonts w:ascii="Calibri" w:hAnsi="Calibri" w:cs="Calibri"/>
-          <w:lang w:val="el-GR"/>
-        </w:rPr>
-      </w:pPr>
-    </w:p>
-    <w:p>
-      <w:pPr>
-        <w:rPr>
-          <w:rFonts w:ascii="Calibri" w:hAnsi="Calibri" w:cs="Calibri"/>
-          <w:lang w:val="el-GR"/>
-        </w:rPr>
-      </w:pPr>
-    </w:p>
-    <w:p>
-      <w:pPr>
-        <w:rPr>
-          <w:rFonts w:ascii="Calibri" w:hAnsi="Calibri" w:cs="Calibri"/>
-          <w:lang w:val="el-GR"/>
-        </w:rPr>
-      </w:pPr>
-    </w:p>
-    <w:p>
-      <w:pPr>
-        <w:rPr>
-          <w:rFonts w:ascii="Calibri" w:hAnsi="Calibri" w:cs="Calibri"/>
-          <w:lang w:val="el-GR"/>
-        </w:rPr>
-      </w:pPr>
-    </w:p>
-    <w:p>
-      <w:pPr>
-        <w:rPr>
-          <w:rFonts w:ascii="Calibri" w:hAnsi="Calibri" w:cs="Calibri"/>
-          <w:lang w:val="el-GR"/>
-        </w:rPr>
-      </w:pPr>
-    </w:p>
-    <w:p>
-      <w:pPr>
-        <w:rPr>
-          <w:rFonts w:ascii="Calibri" w:hAnsi="Calibri" w:cs="Calibri"/>
-          <w:lang w:val="el-GR"/>
-        </w:rPr>
-      </w:pPr>
-    </w:p>
-    <w:p>
-      <w:pPr>
-        <w:rPr>
-          <w:rFonts w:ascii="Calibri" w:hAnsi="Calibri" w:cs="Calibri"/>
-          <w:lang w:val="el-GR"/>
-        </w:rPr>
-      </w:pPr>
-    </w:p>
-    <w:p>
-      <w:pPr>
-        <w:rPr>
-          <w:rFonts w:ascii="Calibri" w:hAnsi="Calibri" w:cs="Calibri"/>
-          <w:lang w:val="el-GR"/>
-        </w:rPr>
-      </w:pPr>
-    </w:p>
-    <w:p>
-      <w:pPr>
-        <w:rPr>
-          <w:rFonts w:ascii="Calibri" w:hAnsi="Calibri" w:cs="Calibri"/>
-          <w:lang w:val="el-GR"/>
-        </w:rPr>
-      </w:pPr>
-    </w:p>
-    <w:p>
-      <w:pPr>
-        <w:rPr>
-          <w:rFonts w:ascii="Calibri" w:hAnsi="Calibri" w:cs="Calibri"/>
-          <w:lang w:val="el-GR"/>
-        </w:rPr>
-      </w:pPr>
-    </w:p>
-    <w:p>
-      <w:pPr>
-        <w:rPr>
-          <w:rFonts w:ascii="Calibri" w:hAnsi="Calibri" w:cs="Calibri"/>
-          <w:lang w:val="el-GR"/>
-        </w:rPr>
-      </w:pPr>
-    </w:p>
-    <w:p>
-      <w:pPr>
-        <w:rPr>
-          <w:rFonts w:ascii="Calibri" w:hAnsi="Calibri" w:cs="Calibri"/>
-          <w:lang w:val="el-GR"/>
-        </w:rPr>
-      </w:pPr>
-    </w:p>
-    <w:p>
-      <w:pPr>
-        <w:rPr>
-          <w:rFonts w:ascii="Calibri" w:hAnsi="Calibri" w:cs="Calibri"/>
-          <w:lang w:val="el-GR"/>
-        </w:rPr>
-      </w:pPr>
-    </w:p>
-    <w:p>
-      <w:pPr>
-        <w:rPr>
-          <w:rFonts w:ascii="Calibri" w:hAnsi="Calibri" w:cs="Calibri"/>
-          <w:lang w:val="el-GR"/>
-        </w:rPr>
-      </w:pPr>
-    </w:p>
-    <w:p>
-      <w:pPr>
-        <w:rPr>
-          <w:rFonts w:ascii="Calibri" w:hAnsi="Calibri" w:cs="Calibri"/>
-          <w:lang w:val="el-GR"/>
-        </w:rPr>
-      </w:pPr>
-    </w:p>
-    <w:p>
-      <w:pPr>
-        <w:rPr>
-          <w:rFonts w:ascii="Calibri" w:hAnsi="Calibri" w:cs="Calibri"/>
-          <w:lang w:val="el-GR"/>
-        </w:rPr>
-      </w:pPr>
-    </w:p>
-    <w:p>
-      <w:pPr>
-        <w:rPr>
-          <w:rFonts w:ascii="Calibri" w:hAnsi="Calibri" w:cs="Calibri"/>
-          <w:lang w:val="el-GR"/>
-        </w:rPr>
-      </w:pPr>
+        <w:t>CRC</w:t>
+      </w:r>
+      <w:r>
+        <w:rPr>
+          <w:rFonts w:ascii="Calibri" w:hAnsi="Calibri" w:cs="Calibri"/>
+          <w:lang w:val="el-GR"/>
+        </w:rPr>
+        <w:t xml:space="preserve"> </w:t>
+      </w:r>
+      <w:r>
+        <w:rPr>
+          <w:rFonts w:ascii="Calibri" w:hAnsi="Calibri" w:cs="Calibri"/>
+        </w:rPr>
+        <w:t>Card</w:t>
+      </w:r>
     </w:p>
     <w:p>
       <w:pPr>
@@ -3523,6 +3445,41 @@
       <w:r>
         <w:rPr>
           <w:rFonts w:ascii="Calibri" w:hAnsi="Calibri" w:cs="Calibri"/>
+          <w:i/>
+          <w:iCs/>
+          <w:lang w:val="el-GR"/>
+        </w:rPr>
+        <w:t xml:space="preserve"> </w:t>
+      </w:r>
+      <w:r>
+        <w:rPr>
+          <w:rFonts w:ascii="Calibri" w:hAnsi="Calibri" w:cs="Calibri"/>
+          <w:i/>
+          <w:iCs/>
+          <w:lang w:val="el-GR"/>
+        </w:rPr>
+        <w:t>(</w:t>
+      </w:r>
+      <w:r>
+        <w:rPr>
+          <w:rFonts w:ascii="Calibri" w:hAnsi="Calibri" w:cs="Calibri"/>
+          <w:i/>
+          <w:iCs/>
+        </w:rPr>
+        <w:t>User</w:t>
+      </w:r>
+      <w:r>
+        <w:rPr>
+          <w:rFonts w:ascii="Calibri" w:hAnsi="Calibri" w:cs="Calibri"/>
+          <w:i/>
+          <w:iCs/>
+          <w:lang w:val="el-GR"/>
+        </w:rPr>
+        <w:t>)</w:t>
+      </w:r>
+      <w:r>
+        <w:rPr>
+          <w:rFonts w:ascii="Calibri" w:hAnsi="Calibri" w:cs="Calibri"/>
           <w:lang w:val="el-GR"/>
         </w:rPr>
         <w:t>.</w:t>
@@ -3544,6 +3501,7 @@
         <w:jc w:val="center"/>
         <w:rPr>
           <w:rFonts w:ascii="Calibri" w:hAnsi="Calibri" w:cs="Calibri"/>
+          <w:lang w:val="el-GR"/>
         </w:rPr>
       </w:pPr>
       <w:r>
@@ -3564,7 +3522,20 @@
         <w:rPr>
           <w:rFonts w:ascii="Calibri" w:hAnsi="Calibri" w:cs="Calibri"/>
         </w:rPr>
-        <w:t>CRC Card</w:t>
+        <w:t>CRC</w:t>
+      </w:r>
+      <w:r>
+        <w:rPr>
+          <w:rFonts w:ascii="Calibri" w:hAnsi="Calibri" w:cs="Calibri"/>
+          <w:lang w:val="el-GR"/>
+        </w:rPr>
+        <w:t xml:space="preserve"> </w:t>
+      </w:r>
+      <w:r>
+        <w:rPr>
+          <w:rFonts w:ascii="Calibri" w:hAnsi="Calibri" w:cs="Calibri"/>
+        </w:rPr>
+        <w:t>Card</w:t>
       </w:r>
     </w:p>
     <w:p>
@@ -3947,6 +3918,7 @@
         <w:jc w:val="center"/>
         <w:rPr>
           <w:rFonts w:ascii="Calibri" w:hAnsi="Calibri" w:cs="Calibri"/>
+          <w:lang w:val="el-GR"/>
         </w:rPr>
       </w:pPr>
       <w:r>
@@ -3967,7 +3939,20 @@
         <w:rPr>
           <w:rFonts w:ascii="Calibri" w:hAnsi="Calibri" w:cs="Calibri"/>
         </w:rPr>
-        <w:t>CRC Card</w:t>
+        <w:t>CRC</w:t>
+      </w:r>
+      <w:r>
+        <w:rPr>
+          <w:rFonts w:ascii="Calibri" w:hAnsi="Calibri" w:cs="Calibri"/>
+          <w:lang w:val="el-GR"/>
+        </w:rPr>
+        <w:t xml:space="preserve"> </w:t>
+      </w:r>
+      <w:r>
+        <w:rPr>
+          <w:rFonts w:ascii="Calibri" w:hAnsi="Calibri" w:cs="Calibri"/>
+        </w:rPr>
+        <w:t>Card</w:t>
       </w:r>
     </w:p>
     <w:p>
@@ -7452,7 +7437,7 @@
         </w:rPr>
         <w:t xml:space="preserve"> με τη χρήση του εργαλείου </w:t>
       </w:r>
-      <w:hyperlink r:id="rId13" w:history="1">
+      <w:hyperlink r:id="rId16" w:history="1">
         <w:r>
           <w:rPr>
             <w:rStyle w:val="Hyperlink"/>
@@ -7510,8 +7495,8 @@
       </w:pPr>
     </w:p>
     <w:sectPr>
-      <w:headerReference w:type="default" r:id="rId14"/>
-      <w:footerReference w:type="default" r:id="rId15"/>
+      <w:headerReference w:type="default" r:id="rId17"/>
+      <w:footerReference w:type="default" r:id="rId18"/>
       <w:pgSz w:w="12240" w:h="15840"/>
       <w:pgMar w:top="1440" w:right="1440" w:bottom="1440" w:left="1440" w:header="720" w:footer="720" w:gutter="0"/>
       <w:cols w:space="720"/>

</xml_diff>

<commit_message>
docs: next 3 seq diagrams and updated docs uc and robustness
</commit_message>
<xml_diff>
--- a/3rd_phase/Sequence-diagram-v0.1.docx
+++ b/3rd_phase/Sequence-diagram-v0.1.docx
@@ -195,6 +195,7 @@
         </w:rPr>
         <w:t xml:space="preserve">: </w:t>
       </w:r>
+      <w:proofErr w:type="spellStart"/>
       <w:r>
         <w:rPr>
           <w:rFonts w:ascii="Calibri" w:hAnsi="Calibri" w:cs="Calibri"/>
@@ -203,6 +204,7 @@
         </w:rPr>
         <w:t>SpecFlow</w:t>
       </w:r>
+      <w:proofErr w:type="spellEnd"/>
     </w:p>
     <w:p>
       <w:pPr>
@@ -385,7 +387,35 @@
         <w:rPr>
           <w:rFonts w:ascii="Calibri" w:hAnsi="Calibri" w:cs="Calibri"/>
         </w:rPr>
-        <w:t>Παναγιώτης Αδριανός</w:t>
+        <w:t>Πανα</w:t>
+      </w:r>
+      <w:proofErr w:type="spellStart"/>
+      <w:r>
+        <w:rPr>
+          <w:rFonts w:ascii="Calibri" w:hAnsi="Calibri" w:cs="Calibri"/>
+        </w:rPr>
+        <w:t>γιώτης</w:t>
+      </w:r>
+      <w:proofErr w:type="spellEnd"/>
+      <w:r>
+        <w:rPr>
+          <w:rFonts w:ascii="Calibri" w:hAnsi="Calibri" w:cs="Calibri"/>
+        </w:rPr>
+        <w:t xml:space="preserve"> </w:t>
+      </w:r>
+      <w:proofErr w:type="spellStart"/>
+      <w:r>
+        <w:rPr>
+          <w:rFonts w:ascii="Calibri" w:hAnsi="Calibri" w:cs="Calibri"/>
+        </w:rPr>
+        <w:t>Αδρι</w:t>
+      </w:r>
+      <w:proofErr w:type="spellEnd"/>
+      <w:r>
+        <w:rPr>
+          <w:rFonts w:ascii="Calibri" w:hAnsi="Calibri" w:cs="Calibri"/>
+        </w:rPr>
+        <w:t>ανός</w:t>
       </w:r>
       <w:r>
         <w:rPr>
@@ -425,7 +455,35 @@
         <w:rPr>
           <w:rFonts w:ascii="Calibri" w:hAnsi="Calibri" w:cs="Calibri"/>
         </w:rPr>
-        <w:t>Παρασκευάς Παπαγιαννόπουλος</w:t>
+        <w:t>Παρα</w:t>
+      </w:r>
+      <w:proofErr w:type="spellStart"/>
+      <w:r>
+        <w:rPr>
+          <w:rFonts w:ascii="Calibri" w:hAnsi="Calibri" w:cs="Calibri"/>
+        </w:rPr>
+        <w:t>σκευάς</w:t>
+      </w:r>
+      <w:proofErr w:type="spellEnd"/>
+      <w:r>
+        <w:rPr>
+          <w:rFonts w:ascii="Calibri" w:hAnsi="Calibri" w:cs="Calibri"/>
+        </w:rPr>
+        <w:t xml:space="preserve"> Παπα</w:t>
+      </w:r>
+      <w:proofErr w:type="spellStart"/>
+      <w:r>
+        <w:rPr>
+          <w:rFonts w:ascii="Calibri" w:hAnsi="Calibri" w:cs="Calibri"/>
+        </w:rPr>
+        <w:t>γι</w:t>
+      </w:r>
+      <w:proofErr w:type="spellEnd"/>
+      <w:r>
+        <w:rPr>
+          <w:rFonts w:ascii="Calibri" w:hAnsi="Calibri" w:cs="Calibri"/>
+        </w:rPr>
+        <w:t>αννόπουλος</w:t>
       </w:r>
       <w:r>
         <w:rPr>
@@ -474,11 +532,33 @@
           <w:lang w:val="el-GR"/>
         </w:rPr>
       </w:pPr>
-      <w:r>
-        <w:rPr>
-          <w:rFonts w:ascii="Calibri" w:hAnsi="Calibri" w:cs="Calibri"/>
-        </w:rPr>
-        <w:t xml:space="preserve">Ιωάννης Αντωνόπουλος, </w:t>
+      <w:proofErr w:type="spellStart"/>
+      <w:r>
+        <w:rPr>
+          <w:rFonts w:ascii="Calibri" w:hAnsi="Calibri" w:cs="Calibri"/>
+        </w:rPr>
+        <w:t>Ιωάννης</w:t>
+      </w:r>
+      <w:proofErr w:type="spellEnd"/>
+      <w:r>
+        <w:rPr>
+          <w:rFonts w:ascii="Calibri" w:hAnsi="Calibri" w:cs="Calibri"/>
+        </w:rPr>
+        <w:t xml:space="preserve"> </w:t>
+      </w:r>
+      <w:proofErr w:type="spellStart"/>
+      <w:r>
+        <w:rPr>
+          <w:rFonts w:ascii="Calibri" w:hAnsi="Calibri" w:cs="Calibri"/>
+        </w:rPr>
+        <w:t>Αντωνό</w:t>
+      </w:r>
+      <w:proofErr w:type="spellEnd"/>
+      <w:r>
+        <w:rPr>
+          <w:rFonts w:ascii="Calibri" w:hAnsi="Calibri" w:cs="Calibri"/>
+        </w:rPr>
+        <w:t xml:space="preserve">πουλος, </w:t>
       </w:r>
       <w:r>
         <w:rPr>
@@ -513,11 +593,33 @@
           <w:rFonts w:ascii="Calibri" w:hAnsi="Calibri" w:cs="Calibri"/>
         </w:rPr>
       </w:pPr>
-      <w:r>
-        <w:rPr>
-          <w:rFonts w:ascii="Calibri" w:hAnsi="Calibri" w:cs="Calibri"/>
-        </w:rPr>
-        <w:t>Νικόλαος Αντωνόπουλος,</w:t>
+      <w:proofErr w:type="spellStart"/>
+      <w:r>
+        <w:rPr>
+          <w:rFonts w:ascii="Calibri" w:hAnsi="Calibri" w:cs="Calibri"/>
+        </w:rPr>
+        <w:t>Νικόλ</w:t>
+      </w:r>
+      <w:proofErr w:type="spellEnd"/>
+      <w:r>
+        <w:rPr>
+          <w:rFonts w:ascii="Calibri" w:hAnsi="Calibri" w:cs="Calibri"/>
+        </w:rPr>
+        <w:t xml:space="preserve">αος </w:t>
+      </w:r>
+      <w:proofErr w:type="spellStart"/>
+      <w:r>
+        <w:rPr>
+          <w:rFonts w:ascii="Calibri" w:hAnsi="Calibri" w:cs="Calibri"/>
+        </w:rPr>
+        <w:t>Αντωνό</w:t>
+      </w:r>
+      <w:proofErr w:type="spellEnd"/>
+      <w:r>
+        <w:rPr>
+          <w:rFonts w:ascii="Calibri" w:hAnsi="Calibri" w:cs="Calibri"/>
+        </w:rPr>
+        <w:t>πουλος,</w:t>
       </w:r>
       <w:r>
         <w:rPr>
@@ -553,11 +655,33 @@
           <w:lang w:val="el-GR"/>
         </w:rPr>
       </w:pPr>
-      <w:r>
-        <w:rPr>
-          <w:rFonts w:ascii="Calibri" w:hAnsi="Calibri" w:cs="Calibri"/>
-        </w:rPr>
-        <w:t xml:space="preserve">Δημήτριος Κούκος, </w:t>
+      <w:proofErr w:type="spellStart"/>
+      <w:r>
+        <w:rPr>
+          <w:rFonts w:ascii="Calibri" w:hAnsi="Calibri" w:cs="Calibri"/>
+        </w:rPr>
+        <w:t>Δημήτριος</w:t>
+      </w:r>
+      <w:proofErr w:type="spellEnd"/>
+      <w:r>
+        <w:rPr>
+          <w:rFonts w:ascii="Calibri" w:hAnsi="Calibri" w:cs="Calibri"/>
+        </w:rPr>
+        <w:t xml:space="preserve"> </w:t>
+      </w:r>
+      <w:proofErr w:type="spellStart"/>
+      <w:r>
+        <w:rPr>
+          <w:rFonts w:ascii="Calibri" w:hAnsi="Calibri" w:cs="Calibri"/>
+        </w:rPr>
+        <w:t>Κούκος</w:t>
+      </w:r>
+      <w:proofErr w:type="spellEnd"/>
+      <w:r>
+        <w:rPr>
+          <w:rFonts w:ascii="Calibri" w:hAnsi="Calibri" w:cs="Calibri"/>
+        </w:rPr>
+        <w:t xml:space="preserve">, </w:t>
       </w:r>
       <w:r>
         <w:rPr>
@@ -682,8 +806,17 @@
           <w:rFonts w:ascii="Calibri" w:hAnsi="Calibri" w:cs="Calibri"/>
           <w:lang w:val="el-GR"/>
         </w:rPr>
-        <w:t xml:space="preserve"> Αξιολογητής</w:t>
-      </w:r>
+        <w:t xml:space="preserve"> </w:t>
+      </w:r>
+      <w:proofErr w:type="spellStart"/>
+      <w:r>
+        <w:rPr>
+          <w:rFonts w:ascii="Calibri" w:hAnsi="Calibri" w:cs="Calibri"/>
+          <w:lang w:val="el-GR"/>
+        </w:rPr>
+        <w:t>Αξιολογητής</w:t>
+      </w:r>
+      <w:proofErr w:type="spellEnd"/>
     </w:p>
     <w:p>
       <w:pPr>
@@ -729,8 +862,17 @@
           <w:rFonts w:ascii="Calibri" w:hAnsi="Calibri" w:cs="Calibri"/>
           <w:lang w:val="el-GR"/>
         </w:rPr>
-        <w:t xml:space="preserve"> Αξιολογητής</w:t>
-      </w:r>
+        <w:t xml:space="preserve"> </w:t>
+      </w:r>
+      <w:proofErr w:type="spellStart"/>
+      <w:r>
+        <w:rPr>
+          <w:rFonts w:ascii="Calibri" w:hAnsi="Calibri" w:cs="Calibri"/>
+          <w:lang w:val="el-GR"/>
+        </w:rPr>
+        <w:t>Αξιολογητής</w:t>
+      </w:r>
+      <w:proofErr w:type="spellEnd"/>
     </w:p>
     <w:p>
       <w:pPr>
@@ -776,8 +918,17 @@
           <w:rFonts w:ascii="Calibri" w:hAnsi="Calibri" w:cs="Calibri"/>
           <w:lang w:val="el-GR"/>
         </w:rPr>
-        <w:t xml:space="preserve"> Αξιολογητής</w:t>
-      </w:r>
+        <w:t xml:space="preserve"> </w:t>
+      </w:r>
+      <w:proofErr w:type="spellStart"/>
+      <w:r>
+        <w:rPr>
+          <w:rFonts w:ascii="Calibri" w:hAnsi="Calibri" w:cs="Calibri"/>
+          <w:lang w:val="el-GR"/>
+        </w:rPr>
+        <w:t>Αξιολογητής</w:t>
+      </w:r>
+      <w:proofErr w:type="spellEnd"/>
     </w:p>
     <w:p>
       <w:pPr>
@@ -823,8 +974,17 @@
           <w:rFonts w:ascii="Calibri" w:hAnsi="Calibri" w:cs="Calibri"/>
           <w:lang w:val="el-GR"/>
         </w:rPr>
-        <w:t xml:space="preserve"> Αξιολογητής</w:t>
-      </w:r>
+        <w:t xml:space="preserve"> </w:t>
+      </w:r>
+      <w:proofErr w:type="spellStart"/>
+      <w:r>
+        <w:rPr>
+          <w:rFonts w:ascii="Calibri" w:hAnsi="Calibri" w:cs="Calibri"/>
+          <w:lang w:val="el-GR"/>
+        </w:rPr>
+        <w:t>Αξιολογητής</w:t>
+      </w:r>
+      <w:proofErr w:type="spellEnd"/>
     </w:p>
     <w:p>
       <w:pPr>
@@ -870,9 +1030,18 @@
           <w:rFonts w:ascii="Calibri" w:hAnsi="Calibri" w:cs="Calibri"/>
           <w:lang w:val="el-GR"/>
         </w:rPr>
-        <w:t xml:space="preserve"> Αξιολογητής</w:t>
+        <w:t xml:space="preserve"> </w:t>
+      </w:r>
+      <w:proofErr w:type="spellStart"/>
+      <w:r>
+        <w:rPr>
+          <w:rFonts w:ascii="Calibri" w:hAnsi="Calibri" w:cs="Calibri"/>
+          <w:lang w:val="el-GR"/>
+        </w:rPr>
+        <w:t>Αξιολογητής</w:t>
       </w:r>
       <w:bookmarkEnd w:id="0"/>
+      <w:proofErr w:type="spellEnd"/>
     </w:p>
     <w:p>
       <w:pPr>
@@ -2139,20 +2308,7 @@
         </w:rPr>
       </w:pPr>
     </w:p>
-    <w:p>
-      <w:pPr>
-        <w:rPr>
-          <w:lang w:val="el-GR"/>
-        </w:rPr>
-      </w:pPr>
-    </w:p>
-    <w:p>
-      <w:pPr>
-        <w:rPr>
-          <w:lang w:val="el-GR"/>
-        </w:rPr>
-      </w:pPr>
-    </w:p>
+    <w:p/>
     <w:p>
       <w:pPr>
         <w:pBdr>
@@ -2174,6 +2330,7 @@
           <w:bCs/>
           <w:lang w:val="el-GR"/>
         </w:rPr>
+        <w:lastRenderedPageBreak/>
         <w:t>Επεξεργασία</w:t>
       </w:r>
       <w:r>
@@ -2423,10 +2580,10 @@
           <w:lang w:val="el-GR"/>
         </w:rPr>
         <w:drawing>
-          <wp:inline distT="0" distB="0" distL="0" distR="0" wp14:anchorId="7BAB7E89" wp14:editId="2B2BB3C7">
-            <wp:extent cx="5943600" cy="6303645"/>
+          <wp:inline distT="0" distB="0" distL="0" distR="0" wp14:anchorId="5926D0CD" wp14:editId="52DA1512">
+            <wp:extent cx="5943600" cy="6322695"/>
             <wp:effectExtent l="0" t="0" r="0" b="1905"/>
-            <wp:docPr id="1918822763" name="Picture 1"/>
+            <wp:docPr id="1896614137" name="Picture 1"/>
             <wp:cNvGraphicFramePr>
               <a:graphicFrameLocks xmlns:a="http://schemas.openxmlformats.org/drawingml/2006/main" noChangeAspect="1"/>
             </wp:cNvGraphicFramePr>
@@ -2434,7 +2591,7 @@
               <a:graphicData uri="http://schemas.openxmlformats.org/drawingml/2006/picture">
                 <pic:pic xmlns:pic="http://schemas.openxmlformats.org/drawingml/2006/picture">
                   <pic:nvPicPr>
-                    <pic:cNvPr id="1918822763" name=""/>
+                    <pic:cNvPr id="1896614137" name=""/>
                     <pic:cNvPicPr/>
                   </pic:nvPicPr>
                   <pic:blipFill>
@@ -2446,7 +2603,7 @@
                   <pic:spPr>
                     <a:xfrm>
                       <a:off x="0" y="0"/>
-                      <a:ext cx="5943600" cy="6303645"/>
+                      <a:ext cx="5943600" cy="6322695"/>
                     </a:xfrm>
                     <a:prstGeom prst="rect">
                       <a:avLst/>
@@ -2514,7 +2671,6 @@
       <w:pPr>
         <w:rPr>
           <w:rFonts w:ascii="Calibri" w:hAnsi="Calibri" w:cs="Calibri"/>
-          <w:lang w:val="el-GR"/>
         </w:rPr>
       </w:pPr>
     </w:p>
@@ -2906,7 +3062,6 @@
       <w:pPr>
         <w:rPr>
           <w:rFonts w:ascii="Calibri" w:hAnsi="Calibri" w:cs="Calibri"/>
-          <w:lang w:val="el-GR"/>
         </w:rPr>
       </w:pPr>
     </w:p>
@@ -3216,15 +3371,6 @@
       <w:pPr>
         <w:rPr>
           <w:rFonts w:ascii="Calibri" w:hAnsi="Calibri" w:cs="Calibri"/>
-          <w:lang w:val="el-GR"/>
-        </w:rPr>
-      </w:pPr>
-    </w:p>
-    <w:p>
-      <w:pPr>
-        <w:rPr>
-          <w:rFonts w:ascii="Calibri" w:hAnsi="Calibri" w:cs="Calibri"/>
-          <w:lang w:val="el-GR"/>
         </w:rPr>
       </w:pPr>
     </w:p>
@@ -3249,6 +3395,7 @@
           <w:bCs/>
           <w:lang w:val="el-GR"/>
         </w:rPr>
+        <w:lastRenderedPageBreak/>
         <w:t>Επεξεργασία</w:t>
       </w:r>
       <w:r>
@@ -3494,6 +3641,47 @@
           <w:lang w:val="el-GR"/>
         </w:rPr>
       </w:pPr>
+      <w:r>
+        <w:rPr>
+          <w:rFonts w:ascii="Calibri" w:hAnsi="Calibri" w:cs="Calibri"/>
+          <w:lang w:val="el-GR"/>
+        </w:rPr>
+        <w:drawing>
+          <wp:inline distT="0" distB="0" distL="0" distR="0" wp14:anchorId="68828938" wp14:editId="35884C99">
+            <wp:extent cx="5943600" cy="6637020"/>
+            <wp:effectExtent l="0" t="0" r="0" b="0"/>
+            <wp:docPr id="2130135923" name="Picture 1"/>
+            <wp:cNvGraphicFramePr>
+              <a:graphicFrameLocks xmlns:a="http://schemas.openxmlformats.org/drawingml/2006/main" noChangeAspect="1"/>
+            </wp:cNvGraphicFramePr>
+            <a:graphic xmlns:a="http://schemas.openxmlformats.org/drawingml/2006/main">
+              <a:graphicData uri="http://schemas.openxmlformats.org/drawingml/2006/picture">
+                <pic:pic xmlns:pic="http://schemas.openxmlformats.org/drawingml/2006/picture">
+                  <pic:nvPicPr>
+                    <pic:cNvPr id="2130135923" name=""/>
+                    <pic:cNvPicPr/>
+                  </pic:nvPicPr>
+                  <pic:blipFill>
+                    <a:blip r:embed="rId16"/>
+                    <a:stretch>
+                      <a:fillRect/>
+                    </a:stretch>
+                  </pic:blipFill>
+                  <pic:spPr>
+                    <a:xfrm>
+                      <a:off x="0" y="0"/>
+                      <a:ext cx="5943600" cy="6637020"/>
+                    </a:xfrm>
+                    <a:prstGeom prst="rect">
+                      <a:avLst/>
+                    </a:prstGeom>
+                  </pic:spPr>
+                </pic:pic>
+              </a:graphicData>
+            </a:graphic>
+          </wp:inline>
+        </w:drawing>
+      </w:r>
     </w:p>
     <w:p>
       <w:pPr>
@@ -3537,166 +3725,6 @@
         </w:rPr>
         <w:t>Card</w:t>
       </w:r>
-    </w:p>
-    <w:p>
-      <w:pPr>
-        <w:rPr>
-          <w:rFonts w:ascii="Calibri" w:hAnsi="Calibri" w:cs="Calibri"/>
-          <w:lang w:val="el-GR"/>
-        </w:rPr>
-      </w:pPr>
-    </w:p>
-    <w:p>
-      <w:pPr>
-        <w:rPr>
-          <w:rFonts w:ascii="Calibri" w:hAnsi="Calibri" w:cs="Calibri"/>
-          <w:lang w:val="el-GR"/>
-        </w:rPr>
-      </w:pPr>
-    </w:p>
-    <w:p>
-      <w:pPr>
-        <w:rPr>
-          <w:rFonts w:ascii="Calibri" w:hAnsi="Calibri" w:cs="Calibri"/>
-          <w:lang w:val="el-GR"/>
-        </w:rPr>
-      </w:pPr>
-    </w:p>
-    <w:p>
-      <w:pPr>
-        <w:rPr>
-          <w:rFonts w:ascii="Calibri" w:hAnsi="Calibri" w:cs="Calibri"/>
-          <w:lang w:val="el-GR"/>
-        </w:rPr>
-      </w:pPr>
-    </w:p>
-    <w:p>
-      <w:pPr>
-        <w:rPr>
-          <w:rFonts w:ascii="Calibri" w:hAnsi="Calibri" w:cs="Calibri"/>
-          <w:lang w:val="el-GR"/>
-        </w:rPr>
-      </w:pPr>
-    </w:p>
-    <w:p>
-      <w:pPr>
-        <w:rPr>
-          <w:rFonts w:ascii="Calibri" w:hAnsi="Calibri" w:cs="Calibri"/>
-          <w:lang w:val="el-GR"/>
-        </w:rPr>
-      </w:pPr>
-    </w:p>
-    <w:p>
-      <w:pPr>
-        <w:rPr>
-          <w:rFonts w:ascii="Calibri" w:hAnsi="Calibri" w:cs="Calibri"/>
-          <w:lang w:val="el-GR"/>
-        </w:rPr>
-      </w:pPr>
-    </w:p>
-    <w:p>
-      <w:pPr>
-        <w:rPr>
-          <w:rFonts w:ascii="Calibri" w:hAnsi="Calibri" w:cs="Calibri"/>
-          <w:lang w:val="el-GR"/>
-        </w:rPr>
-      </w:pPr>
-    </w:p>
-    <w:p>
-      <w:pPr>
-        <w:rPr>
-          <w:rFonts w:ascii="Calibri" w:hAnsi="Calibri" w:cs="Calibri"/>
-          <w:lang w:val="el-GR"/>
-        </w:rPr>
-      </w:pPr>
-    </w:p>
-    <w:p>
-      <w:pPr>
-        <w:rPr>
-          <w:rFonts w:ascii="Calibri" w:hAnsi="Calibri" w:cs="Calibri"/>
-          <w:lang w:val="el-GR"/>
-        </w:rPr>
-      </w:pPr>
-    </w:p>
-    <w:p>
-      <w:pPr>
-        <w:rPr>
-          <w:rFonts w:ascii="Calibri" w:hAnsi="Calibri" w:cs="Calibri"/>
-          <w:lang w:val="el-GR"/>
-        </w:rPr>
-      </w:pPr>
-    </w:p>
-    <w:p>
-      <w:pPr>
-        <w:rPr>
-          <w:rFonts w:ascii="Calibri" w:hAnsi="Calibri" w:cs="Calibri"/>
-          <w:lang w:val="el-GR"/>
-        </w:rPr>
-      </w:pPr>
-    </w:p>
-    <w:p>
-      <w:pPr>
-        <w:rPr>
-          <w:rFonts w:ascii="Calibri" w:hAnsi="Calibri" w:cs="Calibri"/>
-          <w:lang w:val="el-GR"/>
-        </w:rPr>
-      </w:pPr>
-    </w:p>
-    <w:p>
-      <w:pPr>
-        <w:rPr>
-          <w:rFonts w:ascii="Calibri" w:hAnsi="Calibri" w:cs="Calibri"/>
-          <w:lang w:val="el-GR"/>
-        </w:rPr>
-      </w:pPr>
-    </w:p>
-    <w:p>
-      <w:pPr>
-        <w:rPr>
-          <w:rFonts w:ascii="Calibri" w:hAnsi="Calibri" w:cs="Calibri"/>
-          <w:lang w:val="el-GR"/>
-        </w:rPr>
-      </w:pPr>
-    </w:p>
-    <w:p>
-      <w:pPr>
-        <w:rPr>
-          <w:rFonts w:ascii="Calibri" w:hAnsi="Calibri" w:cs="Calibri"/>
-          <w:lang w:val="el-GR"/>
-        </w:rPr>
-      </w:pPr>
-    </w:p>
-    <w:p>
-      <w:pPr>
-        <w:rPr>
-          <w:rFonts w:ascii="Calibri" w:hAnsi="Calibri" w:cs="Calibri"/>
-          <w:lang w:val="el-GR"/>
-        </w:rPr>
-      </w:pPr>
-    </w:p>
-    <w:p>
-      <w:pPr>
-        <w:rPr>
-          <w:rFonts w:ascii="Calibri" w:hAnsi="Calibri" w:cs="Calibri"/>
-          <w:lang w:val="el-GR"/>
-        </w:rPr>
-      </w:pPr>
-    </w:p>
-    <w:p>
-      <w:pPr>
-        <w:rPr>
-          <w:rFonts w:ascii="Calibri" w:hAnsi="Calibri" w:cs="Calibri"/>
-          <w:lang w:val="el-GR"/>
-        </w:rPr>
-      </w:pPr>
-    </w:p>
-    <w:p>
-      <w:pPr>
-        <w:rPr>
-          <w:rFonts w:ascii="Calibri" w:hAnsi="Calibri" w:cs="Calibri"/>
-          <w:lang w:val="el-GR"/>
-        </w:rPr>
-      </w:pPr>
     </w:p>
     <w:p>
       <w:pPr>
@@ -3719,6 +3747,7 @@
           <w:bCs/>
           <w:lang w:val="el-GR"/>
         </w:rPr>
+        <w:lastRenderedPageBreak/>
         <w:t>Διαγραφή</w:t>
       </w:r>
       <w:r>
@@ -3897,6 +3926,32 @@
       <w:r>
         <w:rPr>
           <w:rFonts w:ascii="Calibri" w:hAnsi="Calibri" w:cs="Calibri"/>
+          <w:i/>
+          <w:iCs/>
+          <w:lang w:val="el-GR"/>
+        </w:rPr>
+        <w:t xml:space="preserve"> (</w:t>
+      </w:r>
+      <w:r>
+        <w:rPr>
+          <w:rFonts w:ascii="Calibri" w:hAnsi="Calibri" w:cs="Calibri"/>
+          <w:i/>
+          <w:iCs/>
+        </w:rPr>
+        <w:t>User</w:t>
+      </w:r>
+      <w:r>
+        <w:rPr>
+          <w:rFonts w:ascii="Calibri" w:hAnsi="Calibri" w:cs="Calibri"/>
+          <w:i/>
+          <w:iCs/>
+          <w:lang w:val="el-GR"/>
+        </w:rPr>
+        <w:t>)</w:t>
+      </w:r>
+      <w:r>
+        <w:rPr>
+          <w:rFonts w:ascii="Calibri" w:hAnsi="Calibri" w:cs="Calibri"/>
           <w:lang w:val="el-GR"/>
         </w:rPr>
         <w:t>.</w:t>
@@ -3911,6 +3966,47 @@
           <w:lang w:val="el-GR"/>
         </w:rPr>
       </w:pPr>
+      <w:r>
+        <w:rPr>
+          <w:rFonts w:ascii="Calibri" w:hAnsi="Calibri" w:cs="Calibri"/>
+          <w:lang w:val="el-GR"/>
+        </w:rPr>
+        <w:drawing>
+          <wp:inline distT="0" distB="0" distL="0" distR="0" wp14:anchorId="2B0F5214" wp14:editId="0CFF9113">
+            <wp:extent cx="5943600" cy="4470400"/>
+            <wp:effectExtent l="0" t="0" r="0" b="6350"/>
+            <wp:docPr id="1490056406" name="Picture 1"/>
+            <wp:cNvGraphicFramePr>
+              <a:graphicFrameLocks xmlns:a="http://schemas.openxmlformats.org/drawingml/2006/main" noChangeAspect="1"/>
+            </wp:cNvGraphicFramePr>
+            <a:graphic xmlns:a="http://schemas.openxmlformats.org/drawingml/2006/main">
+              <a:graphicData uri="http://schemas.openxmlformats.org/drawingml/2006/picture">
+                <pic:pic xmlns:pic="http://schemas.openxmlformats.org/drawingml/2006/picture">
+                  <pic:nvPicPr>
+                    <pic:cNvPr id="1490056406" name=""/>
+                    <pic:cNvPicPr/>
+                  </pic:nvPicPr>
+                  <pic:blipFill>
+                    <a:blip r:embed="rId17"/>
+                    <a:stretch>
+                      <a:fillRect/>
+                    </a:stretch>
+                  </pic:blipFill>
+                  <pic:spPr>
+                    <a:xfrm>
+                      <a:off x="0" y="0"/>
+                      <a:ext cx="5943600" cy="4470400"/>
+                    </a:xfrm>
+                    <a:prstGeom prst="rect">
+                      <a:avLst/>
+                    </a:prstGeom>
+                  </pic:spPr>
+                </pic:pic>
+              </a:graphicData>
+            </a:graphic>
+          </wp:inline>
+        </w:drawing>
+      </w:r>
     </w:p>
     <w:p>
       <w:pPr>
@@ -4007,111 +4103,6 @@
       <w:pPr>
         <w:rPr>
           <w:rFonts w:ascii="Calibri" w:hAnsi="Calibri" w:cs="Calibri"/>
-          <w:lang w:val="el-GR"/>
-        </w:rPr>
-      </w:pPr>
-    </w:p>
-    <w:p>
-      <w:pPr>
-        <w:rPr>
-          <w:rFonts w:ascii="Calibri" w:hAnsi="Calibri" w:cs="Calibri"/>
-          <w:lang w:val="el-GR"/>
-        </w:rPr>
-      </w:pPr>
-    </w:p>
-    <w:p>
-      <w:pPr>
-        <w:rPr>
-          <w:rFonts w:ascii="Calibri" w:hAnsi="Calibri" w:cs="Calibri"/>
-          <w:lang w:val="el-GR"/>
-        </w:rPr>
-      </w:pPr>
-    </w:p>
-    <w:p>
-      <w:pPr>
-        <w:rPr>
-          <w:rFonts w:ascii="Calibri" w:hAnsi="Calibri" w:cs="Calibri"/>
-          <w:lang w:val="el-GR"/>
-        </w:rPr>
-      </w:pPr>
-    </w:p>
-    <w:p>
-      <w:pPr>
-        <w:rPr>
-          <w:rFonts w:ascii="Calibri" w:hAnsi="Calibri" w:cs="Calibri"/>
-          <w:lang w:val="el-GR"/>
-        </w:rPr>
-      </w:pPr>
-    </w:p>
-    <w:p>
-      <w:pPr>
-        <w:rPr>
-          <w:rFonts w:ascii="Calibri" w:hAnsi="Calibri" w:cs="Calibri"/>
-          <w:lang w:val="el-GR"/>
-        </w:rPr>
-      </w:pPr>
-    </w:p>
-    <w:p>
-      <w:pPr>
-        <w:rPr>
-          <w:rFonts w:ascii="Calibri" w:hAnsi="Calibri" w:cs="Calibri"/>
-          <w:lang w:val="el-GR"/>
-        </w:rPr>
-      </w:pPr>
-    </w:p>
-    <w:p>
-      <w:pPr>
-        <w:rPr>
-          <w:rFonts w:ascii="Calibri" w:hAnsi="Calibri" w:cs="Calibri"/>
-          <w:lang w:val="el-GR"/>
-        </w:rPr>
-      </w:pPr>
-    </w:p>
-    <w:p>
-      <w:pPr>
-        <w:rPr>
-          <w:rFonts w:ascii="Calibri" w:hAnsi="Calibri" w:cs="Calibri"/>
-          <w:lang w:val="el-GR"/>
-        </w:rPr>
-      </w:pPr>
-    </w:p>
-    <w:p>
-      <w:pPr>
-        <w:rPr>
-          <w:rFonts w:ascii="Calibri" w:hAnsi="Calibri" w:cs="Calibri"/>
-          <w:lang w:val="el-GR"/>
-        </w:rPr>
-      </w:pPr>
-    </w:p>
-    <w:p>
-      <w:pPr>
-        <w:rPr>
-          <w:rFonts w:ascii="Calibri" w:hAnsi="Calibri" w:cs="Calibri"/>
-          <w:lang w:val="el-GR"/>
-        </w:rPr>
-      </w:pPr>
-    </w:p>
-    <w:p>
-      <w:pPr>
-        <w:rPr>
-          <w:rFonts w:ascii="Calibri" w:hAnsi="Calibri" w:cs="Calibri"/>
-          <w:lang w:val="el-GR"/>
-        </w:rPr>
-      </w:pPr>
-    </w:p>
-    <w:p>
-      <w:pPr>
-        <w:rPr>
-          <w:rFonts w:ascii="Calibri" w:hAnsi="Calibri" w:cs="Calibri"/>
-          <w:lang w:val="el-GR"/>
-        </w:rPr>
-      </w:pPr>
-    </w:p>
-    <w:p>
-      <w:pPr>
-        <w:rPr>
-          <w:rFonts w:ascii="Calibri" w:hAnsi="Calibri" w:cs="Calibri"/>
-          <w:lang w:val="el-GR"/>
         </w:rPr>
       </w:pPr>
     </w:p>
@@ -4307,6 +4298,7 @@
         </w:rPr>
         <w:t xml:space="preserve">, τον </w:t>
       </w:r>
+      <w:proofErr w:type="spellStart"/>
       <w:r>
         <w:rPr>
           <w:rFonts w:ascii="Calibri" w:eastAsia="Arial" w:hAnsi="Calibri" w:cs="Calibri"/>
@@ -4316,6 +4308,7 @@
         </w:rPr>
         <w:t>Αξιολογητή</w:t>
       </w:r>
+      <w:proofErr w:type="spellEnd"/>
       <w:r>
         <w:rPr>
           <w:rFonts w:ascii="Calibri" w:eastAsia="Arial" w:hAnsi="Calibri" w:cs="Calibri"/>
@@ -4369,6 +4362,32 @@
       <w:r>
         <w:rPr>
           <w:rFonts w:ascii="Calibri" w:hAnsi="Calibri" w:cs="Calibri"/>
+          <w:i/>
+          <w:iCs/>
+          <w:lang w:val="el-GR"/>
+        </w:rPr>
+        <w:t xml:space="preserve"> (</w:t>
+      </w:r>
+      <w:r>
+        <w:rPr>
+          <w:rFonts w:ascii="Calibri" w:hAnsi="Calibri" w:cs="Calibri"/>
+          <w:i/>
+          <w:iCs/>
+        </w:rPr>
+        <w:t>User</w:t>
+      </w:r>
+      <w:r>
+        <w:rPr>
+          <w:rFonts w:ascii="Calibri" w:hAnsi="Calibri" w:cs="Calibri"/>
+          <w:i/>
+          <w:iCs/>
+          <w:lang w:val="el-GR"/>
+        </w:rPr>
+        <w:t>)</w:t>
+      </w:r>
+      <w:r>
+        <w:rPr>
+          <w:rFonts w:ascii="Calibri" w:hAnsi="Calibri" w:cs="Calibri"/>
           <w:lang w:val="el-GR"/>
         </w:rPr>
         <w:t>.</w:t>
@@ -4382,6 +4401,46 @@
           <w:lang w:val="el-GR"/>
         </w:rPr>
       </w:pPr>
+      <w:r>
+        <w:rPr>
+          <w:lang w:val="el-GR"/>
+        </w:rPr>
+        <w:drawing>
+          <wp:inline distT="0" distB="0" distL="0" distR="0" wp14:anchorId="14D8BE7F" wp14:editId="4BA0C8AF">
+            <wp:extent cx="5943600" cy="4808855"/>
+            <wp:effectExtent l="0" t="0" r="0" b="0"/>
+            <wp:docPr id="1824266092" name="Picture 1"/>
+            <wp:cNvGraphicFramePr>
+              <a:graphicFrameLocks xmlns:a="http://schemas.openxmlformats.org/drawingml/2006/main" noChangeAspect="1"/>
+            </wp:cNvGraphicFramePr>
+            <a:graphic xmlns:a="http://schemas.openxmlformats.org/drawingml/2006/main">
+              <a:graphicData uri="http://schemas.openxmlformats.org/drawingml/2006/picture">
+                <pic:pic xmlns:pic="http://schemas.openxmlformats.org/drawingml/2006/picture">
+                  <pic:nvPicPr>
+                    <pic:cNvPr id="1824266092" name=""/>
+                    <pic:cNvPicPr/>
+                  </pic:nvPicPr>
+                  <pic:blipFill>
+                    <a:blip r:embed="rId18"/>
+                    <a:stretch>
+                      <a:fillRect/>
+                    </a:stretch>
+                  </pic:blipFill>
+                  <pic:spPr>
+                    <a:xfrm>
+                      <a:off x="0" y="0"/>
+                      <a:ext cx="5943600" cy="4808855"/>
+                    </a:xfrm>
+                    <a:prstGeom prst="rect">
+                      <a:avLst/>
+                    </a:prstGeom>
+                  </pic:spPr>
+                </pic:pic>
+              </a:graphicData>
+            </a:graphic>
+          </wp:inline>
+        </w:drawing>
+      </w:r>
     </w:p>
     <w:p>
       <w:pPr>
@@ -4458,135 +4517,13 @@
       <w:pPr>
         <w:rPr>
           <w:rFonts w:ascii="Calibri" w:hAnsi="Calibri" w:cs="Calibri"/>
-          <w:lang w:val="el-GR"/>
-        </w:rPr>
-      </w:pPr>
-    </w:p>
-    <w:p>
-      <w:pPr>
-        <w:rPr>
-          <w:rFonts w:ascii="Calibri" w:hAnsi="Calibri" w:cs="Calibri"/>
-          <w:lang w:val="el-GR"/>
-        </w:rPr>
-      </w:pPr>
-    </w:p>
-    <w:p>
-      <w:pPr>
-        <w:rPr>
-          <w:rFonts w:ascii="Calibri" w:hAnsi="Calibri" w:cs="Calibri"/>
-          <w:lang w:val="el-GR"/>
-        </w:rPr>
-      </w:pPr>
-    </w:p>
-    <w:p>
-      <w:pPr>
-        <w:rPr>
-          <w:rFonts w:ascii="Calibri" w:hAnsi="Calibri" w:cs="Calibri"/>
-          <w:lang w:val="el-GR"/>
-        </w:rPr>
-      </w:pPr>
-    </w:p>
-    <w:p>
-      <w:pPr>
-        <w:rPr>
-          <w:rFonts w:ascii="Calibri" w:hAnsi="Calibri" w:cs="Calibri"/>
-          <w:lang w:val="el-GR"/>
-        </w:rPr>
-      </w:pPr>
-    </w:p>
-    <w:p>
-      <w:pPr>
-        <w:rPr>
-          <w:rFonts w:ascii="Calibri" w:hAnsi="Calibri" w:cs="Calibri"/>
-          <w:lang w:val="el-GR"/>
-        </w:rPr>
-      </w:pPr>
-    </w:p>
-    <w:p>
-      <w:pPr>
-        <w:rPr>
-          <w:rFonts w:ascii="Calibri" w:hAnsi="Calibri" w:cs="Calibri"/>
-          <w:lang w:val="el-GR"/>
-        </w:rPr>
-      </w:pPr>
-    </w:p>
-    <w:p>
-      <w:pPr>
-        <w:rPr>
-          <w:rFonts w:ascii="Calibri" w:hAnsi="Calibri" w:cs="Calibri"/>
-          <w:lang w:val="el-GR"/>
-        </w:rPr>
-      </w:pPr>
-    </w:p>
-    <w:p>
-      <w:pPr>
-        <w:rPr>
-          <w:rFonts w:ascii="Calibri" w:hAnsi="Calibri" w:cs="Calibri"/>
-          <w:lang w:val="el-GR"/>
-        </w:rPr>
-      </w:pPr>
-    </w:p>
-    <w:p>
-      <w:pPr>
-        <w:rPr>
-          <w:rFonts w:ascii="Calibri" w:hAnsi="Calibri" w:cs="Calibri"/>
-          <w:lang w:val="el-GR"/>
-        </w:rPr>
-      </w:pPr>
-    </w:p>
-    <w:p>
-      <w:pPr>
-        <w:rPr>
-          <w:rFonts w:ascii="Calibri" w:hAnsi="Calibri" w:cs="Calibri"/>
-          <w:lang w:val="el-GR"/>
-        </w:rPr>
-      </w:pPr>
-    </w:p>
-    <w:p>
-      <w:pPr>
-        <w:rPr>
-          <w:rFonts w:ascii="Calibri" w:hAnsi="Calibri" w:cs="Calibri"/>
-          <w:lang w:val="el-GR"/>
-        </w:rPr>
-      </w:pPr>
-    </w:p>
-    <w:p>
-      <w:pPr>
-        <w:rPr>
-          <w:rFonts w:ascii="Calibri" w:hAnsi="Calibri" w:cs="Calibri"/>
-          <w:lang w:val="el-GR"/>
-        </w:rPr>
-      </w:pPr>
-    </w:p>
-    <w:p>
-      <w:pPr>
-        <w:rPr>
-          <w:rFonts w:ascii="Calibri" w:hAnsi="Calibri" w:cs="Calibri"/>
-          <w:lang w:val="el-GR"/>
-        </w:rPr>
-      </w:pPr>
-    </w:p>
-    <w:p>
-      <w:pPr>
-        <w:rPr>
-          <w:rFonts w:ascii="Calibri" w:hAnsi="Calibri" w:cs="Calibri"/>
-          <w:lang w:val="el-GR"/>
-        </w:rPr>
-      </w:pPr>
-    </w:p>
-    <w:p>
-      <w:pPr>
-        <w:rPr>
-          <w:rFonts w:ascii="Calibri" w:hAnsi="Calibri" w:cs="Calibri"/>
-          <w:lang w:val="el-GR"/>
-        </w:rPr>
-      </w:pPr>
-    </w:p>
-    <w:p>
-      <w:pPr>
-        <w:rPr>
-          <w:rFonts w:ascii="Calibri" w:hAnsi="Calibri" w:cs="Calibri"/>
-          <w:lang w:val="el-GR"/>
+        </w:rPr>
+      </w:pPr>
+    </w:p>
+    <w:p>
+      <w:pPr>
+        <w:rPr>
+          <w:rFonts w:ascii="Calibri" w:hAnsi="Calibri" w:cs="Calibri"/>
         </w:rPr>
       </w:pPr>
     </w:p>
@@ -4711,12 +4648,21 @@
         </w:rPr>
         <w:t xml:space="preserve"> διαγράμματος </w:t>
       </w:r>
-      <w:r>
-        <w:rPr>
-          <w:rFonts w:ascii="Calibri" w:hAnsi="Calibri" w:cs="Calibri"/>
-          <w:lang w:val="el-GR"/>
-        </w:rPr>
-        <w:t>Διαγράμματος Κλάσεων</w:t>
+      <w:proofErr w:type="spellStart"/>
+      <w:r>
+        <w:rPr>
+          <w:rFonts w:ascii="Calibri" w:hAnsi="Calibri" w:cs="Calibri"/>
+          <w:lang w:val="el-GR"/>
+        </w:rPr>
+        <w:t>Διαγράμματος</w:t>
+      </w:r>
+      <w:proofErr w:type="spellEnd"/>
+      <w:r>
+        <w:rPr>
+          <w:rFonts w:ascii="Calibri" w:hAnsi="Calibri" w:cs="Calibri"/>
+          <w:lang w:val="el-GR"/>
+        </w:rPr>
+        <w:t xml:space="preserve"> Κλάσεων</w:t>
       </w:r>
       <w:r>
         <w:rPr>
@@ -4766,6 +4712,7 @@
         </w:rPr>
         <w:t xml:space="preserve">, τον </w:t>
       </w:r>
+      <w:proofErr w:type="spellStart"/>
       <w:r>
         <w:rPr>
           <w:rFonts w:ascii="Calibri" w:eastAsia="Arial" w:hAnsi="Calibri" w:cs="Calibri"/>
@@ -4775,6 +4722,7 @@
         </w:rPr>
         <w:t>Αξιολογητή</w:t>
       </w:r>
+      <w:proofErr w:type="spellEnd"/>
       <w:r>
         <w:rPr>
           <w:rFonts w:ascii="Calibri" w:eastAsia="Arial" w:hAnsi="Calibri" w:cs="Calibri"/>
@@ -4841,6 +4789,46 @@
           <w:lang w:val="el-GR"/>
         </w:rPr>
       </w:pPr>
+      <w:r>
+        <w:rPr>
+          <w:lang w:val="el-GR"/>
+        </w:rPr>
+        <w:drawing>
+          <wp:inline distT="0" distB="0" distL="0" distR="0" wp14:anchorId="3B0C36F4" wp14:editId="1F2B4AEF">
+            <wp:extent cx="5943600" cy="5339080"/>
+            <wp:effectExtent l="0" t="0" r="0" b="0"/>
+            <wp:docPr id="1518853578" name="Picture 1"/>
+            <wp:cNvGraphicFramePr>
+              <a:graphicFrameLocks xmlns:a="http://schemas.openxmlformats.org/drawingml/2006/main" noChangeAspect="1"/>
+            </wp:cNvGraphicFramePr>
+            <a:graphic xmlns:a="http://schemas.openxmlformats.org/drawingml/2006/main">
+              <a:graphicData uri="http://schemas.openxmlformats.org/drawingml/2006/picture">
+                <pic:pic xmlns:pic="http://schemas.openxmlformats.org/drawingml/2006/picture">
+                  <pic:nvPicPr>
+                    <pic:cNvPr id="1518853578" name=""/>
+                    <pic:cNvPicPr/>
+                  </pic:nvPicPr>
+                  <pic:blipFill>
+                    <a:blip r:embed="rId19"/>
+                    <a:stretch>
+                      <a:fillRect/>
+                    </a:stretch>
+                  </pic:blipFill>
+                  <pic:spPr>
+                    <a:xfrm>
+                      <a:off x="0" y="0"/>
+                      <a:ext cx="5943600" cy="5339080"/>
+                    </a:xfrm>
+                    <a:prstGeom prst="rect">
+                      <a:avLst/>
+                    </a:prstGeom>
+                  </pic:spPr>
+                </pic:pic>
+              </a:graphicData>
+            </a:graphic>
+          </wp:inline>
+        </w:drawing>
+      </w:r>
     </w:p>
     <w:p>
       <w:pPr>
@@ -5246,6 +5234,7 @@
         </w:rPr>
         <w:t xml:space="preserve">, τον </w:t>
       </w:r>
+      <w:proofErr w:type="spellStart"/>
       <w:r>
         <w:rPr>
           <w:rFonts w:ascii="Calibri" w:eastAsia="Arial" w:hAnsi="Calibri" w:cs="Calibri"/>
@@ -5255,6 +5244,7 @@
         </w:rPr>
         <w:t>Αξιολογητή</w:t>
       </w:r>
+      <w:proofErr w:type="spellEnd"/>
       <w:r>
         <w:rPr>
           <w:rFonts w:ascii="Calibri" w:eastAsia="Arial" w:hAnsi="Calibri" w:cs="Calibri"/>
@@ -5319,7 +5309,23 @@
           <w:rFonts w:ascii="Calibri" w:hAnsi="Calibri" w:cs="Calibri"/>
           <w:lang w:val="el-GR"/>
         </w:rPr>
-        <w:t xml:space="preserve"> παρουσιάζουμε την οπτικοποίηση του διαγράμματος μέσω της εφαρμογής </w:t>
+        <w:t xml:space="preserve"> παρουσιάζουμε την </w:t>
+      </w:r>
+      <w:proofErr w:type="spellStart"/>
+      <w:r>
+        <w:rPr>
+          <w:rFonts w:ascii="Calibri" w:hAnsi="Calibri" w:cs="Calibri"/>
+          <w:lang w:val="el-GR"/>
+        </w:rPr>
+        <w:t>οπτικοποίηση</w:t>
+      </w:r>
+      <w:proofErr w:type="spellEnd"/>
+      <w:r>
+        <w:rPr>
+          <w:rFonts w:ascii="Calibri" w:hAnsi="Calibri" w:cs="Calibri"/>
+          <w:lang w:val="el-GR"/>
+        </w:rPr>
+        <w:t xml:space="preserve"> του διαγράμματος μέσω της εφαρμογής </w:t>
       </w:r>
       <w:r>
         <w:rPr>
@@ -5334,12 +5340,14 @@
         </w:rPr>
         <w:t>-</w:t>
       </w:r>
+      <w:proofErr w:type="spellStart"/>
       <w:r>
         <w:rPr>
           <w:rFonts w:ascii="Calibri" w:hAnsi="Calibri" w:cs="Calibri"/>
         </w:rPr>
         <w:t>uml</w:t>
       </w:r>
+      <w:proofErr w:type="spellEnd"/>
     </w:p>
     <w:p>
       <w:pPr>
@@ -6278,6 +6286,7 @@
         </w:rPr>
         <w:t xml:space="preserve">». Ως Χρήστη θεωρούμε  τον </w:t>
       </w:r>
+      <w:proofErr w:type="spellStart"/>
       <w:r>
         <w:rPr>
           <w:rFonts w:ascii="Calibri" w:eastAsia="Arial" w:hAnsi="Calibri" w:cs="Calibri"/>
@@ -6285,7 +6294,17 @@
           <w:iCs/>
           <w:lang w:val="el-GR"/>
         </w:rPr>
-        <w:t xml:space="preserve">Αξιολογητή </w:t>
+        <w:t>Αξιολογητή</w:t>
+      </w:r>
+      <w:proofErr w:type="spellEnd"/>
+      <w:r>
+        <w:rPr>
+          <w:rFonts w:ascii="Calibri" w:eastAsia="Arial" w:hAnsi="Calibri" w:cs="Calibri"/>
+          <w:i/>
+          <w:iCs/>
+          <w:lang w:val="el-GR"/>
+        </w:rPr>
+        <w:t xml:space="preserve"> </w:t>
       </w:r>
       <w:r>
         <w:rPr>
@@ -6661,6 +6680,7 @@
         </w:rPr>
         <w:t xml:space="preserve">». Ως Χρήστη θεωρούμε τον </w:t>
       </w:r>
+      <w:proofErr w:type="spellStart"/>
       <w:r>
         <w:rPr>
           <w:rFonts w:ascii="Calibri" w:eastAsia="Arial" w:hAnsi="Calibri" w:cs="Calibri"/>
@@ -6668,7 +6688,17 @@
           <w:iCs/>
           <w:lang w:val="el-GR"/>
         </w:rPr>
-        <w:t xml:space="preserve">Αξιολογητή </w:t>
+        <w:t>Αξιολογητή</w:t>
+      </w:r>
+      <w:proofErr w:type="spellEnd"/>
+      <w:r>
+        <w:rPr>
+          <w:rFonts w:ascii="Calibri" w:eastAsia="Arial" w:hAnsi="Calibri" w:cs="Calibri"/>
+          <w:i/>
+          <w:iCs/>
+          <w:lang w:val="el-GR"/>
+        </w:rPr>
+        <w:t xml:space="preserve"> </w:t>
       </w:r>
       <w:r>
         <w:rPr>
@@ -7437,7 +7467,7 @@
         </w:rPr>
         <w:t xml:space="preserve"> με τη χρήση του εργαλείου </w:t>
       </w:r>
-      <w:hyperlink r:id="rId16" w:history="1">
+      <w:hyperlink r:id="rId20" w:history="1">
         <w:r>
           <w:rPr>
             <w:rStyle w:val="Hyperlink"/>
@@ -7495,8 +7525,8 @@
       </w:pPr>
     </w:p>
     <w:sectPr>
-      <w:headerReference w:type="default" r:id="rId17"/>
-      <w:footerReference w:type="default" r:id="rId18"/>
+      <w:headerReference w:type="default" r:id="rId21"/>
+      <w:footerReference w:type="default" r:id="rId22"/>
       <w:pgSz w:w="12240" w:h="15840"/>
       <w:pgMar w:top="1440" w:right="1440" w:bottom="1440" w:left="1440" w:header="720" w:footer="720" w:gutter="0"/>
       <w:cols w:space="720"/>

</xml_diff>